<commit_message>
docs: fill Individual Contributions table in report
</commit_message>
<xml_diff>
--- a/docs/REVIEW1WEBAPP.docx
+++ b/docs/REVIEW1WEBAPP.docx
@@ -12272,6 +12272,9 @@
             <w:pPr>
               <w:spacing w:before="20" w:after="20" w:line="280" w:lineRule="auto"/>
             </w:pPr>
+            <w:r>
+              <w:t>Lakshya</w:t>
+            </w:r>
           </w:p>
         </w:tc>
         <w:tc>
@@ -12289,6 +12292,9 @@
             <w:pPr>
               <w:spacing w:before="20" w:after="20" w:line="280" w:lineRule="auto"/>
             </w:pPr>
+            <w:r>
+              <w:t>23BCI0153</w:t>
+            </w:r>
           </w:p>
         </w:tc>
         <w:tc>
@@ -12330,6 +12336,9 @@
             <w:pPr>
               <w:spacing w:before="20" w:after="20" w:line="280" w:lineRule="auto"/>
             </w:pPr>
+            <w:r>
+              <w:t>20%</w:t>
+            </w:r>
           </w:p>
         </w:tc>
       </w:tr>
@@ -12355,6 +12364,9 @@
             <w:pPr>
               <w:spacing w:before="20" w:after="20" w:line="280" w:lineRule="auto"/>
             </w:pPr>
+            <w:r>
+              <w:t>Abhinav</w:t>
+            </w:r>
           </w:p>
         </w:tc>
         <w:tc>
@@ -12372,6 +12384,9 @@
             <w:pPr>
               <w:spacing w:before="20" w:after="20" w:line="280" w:lineRule="auto"/>
             </w:pPr>
+            <w:r>
+              <w:t>23BCI0211</w:t>
+            </w:r>
           </w:p>
         </w:tc>
         <w:tc>
@@ -12413,6 +12428,9 @@
             <w:pPr>
               <w:spacing w:before="20" w:after="20" w:line="280" w:lineRule="auto"/>
             </w:pPr>
+            <w:r>
+              <w:t>20%</w:t>
+            </w:r>
           </w:p>
         </w:tc>
       </w:tr>
@@ -12438,6 +12456,9 @@
             <w:pPr>
               <w:spacing w:before="20" w:after="20" w:line="280" w:lineRule="auto"/>
             </w:pPr>
+            <w:r>
+              <w:t>Anshuman</w:t>
+            </w:r>
           </w:p>
         </w:tc>
         <w:tc>
@@ -12455,6 +12476,9 @@
             <w:pPr>
               <w:spacing w:before="20" w:after="20" w:line="280" w:lineRule="auto"/>
             </w:pPr>
+            <w:r>
+              <w:t>23BCI0170</w:t>
+            </w:r>
           </w:p>
         </w:tc>
         <w:tc>
@@ -12496,6 +12520,9 @@
             <w:pPr>
               <w:spacing w:before="20" w:after="20" w:line="280" w:lineRule="auto"/>
             </w:pPr>
+            <w:r>
+              <w:t>20%</w:t>
+            </w:r>
           </w:p>
         </w:tc>
       </w:tr>
@@ -12521,6 +12548,9 @@
             <w:pPr>
               <w:spacing w:before="20" w:after="20" w:line="280" w:lineRule="auto"/>
             </w:pPr>
+            <w:r>
+              <w:t>Prince</w:t>
+            </w:r>
           </w:p>
         </w:tc>
         <w:tc>
@@ -12538,6 +12568,9 @@
             <w:pPr>
               <w:spacing w:before="20" w:after="20" w:line="280" w:lineRule="auto"/>
             </w:pPr>
+            <w:r>
+              <w:t>23BCI0145</w:t>
+            </w:r>
           </w:p>
         </w:tc>
         <w:tc>
@@ -12595,6 +12628,9 @@
             <w:pPr>
               <w:spacing w:before="20" w:after="20" w:line="280" w:lineRule="auto"/>
             </w:pPr>
+            <w:r>
+              <w:t>20%</w:t>
+            </w:r>
           </w:p>
         </w:tc>
       </w:tr>
@@ -12620,6 +12656,9 @@
             <w:pPr>
               <w:spacing w:before="20" w:after="20" w:line="280" w:lineRule="auto"/>
             </w:pPr>
+            <w:r>
+              <w:t>Puneesh Gulati</w:t>
+            </w:r>
           </w:p>
         </w:tc>
         <w:tc>
@@ -12637,6 +12676,9 @@
             <w:pPr>
               <w:spacing w:before="20" w:after="20" w:line="280" w:lineRule="auto"/>
             </w:pPr>
+            <w:r>
+              <w:t>23BCI0168</w:t>
+            </w:r>
           </w:p>
         </w:tc>
         <w:tc>
@@ -12678,6 +12720,9 @@
             <w:pPr>
               <w:spacing w:before="20" w:after="20" w:line="280" w:lineRule="auto"/>
             </w:pPr>
+            <w:r>
+              <w:t>20%</w:t>
+            </w:r>
           </w:p>
         </w:tc>
       </w:tr>

</xml_diff>